<commit_message>
Update paper and REVIEW for v2 (seed-averaged results, 95% CIs, CV tuning, per-class reliability)
Table I -> seed-averaged means; §III text updated to new numbers (shifts <=0.002,
all claims preserved); §II-B adds the 20-split protocol + CI reporting; §II-C now
describes the real k-fold-CV grid search; §II-D adds two bin counts + per-class
reliability (Fig 1b). Markdown regenerated from the corrected docx. REVIEW marks
findings #2/#3/#6 resolved.
</commit_message>
<xml_diff>
--- a/paper/URTC_paper.docx
+++ b/paper/URTC_paper.docx
@@ -95,7 +95,7 @@
           <w:sz w:val="18"/>
           <w:szCs w:val="18"/>
         </w:rPr>
-        <w:t xml:space="preserve">Modern photometric surveys classify far more astronomical sources than can be confirmed spectroscopically, and increasingly rely on the probabilities output by machine-learning classifiers to build clean samples and prioritize follow-up. Such probabilities are useful only if they are calibrated: an object assigned 90% confidence should belong to the predicted class about 90% of the time. While accuracy degradation toward faint magnitudes is well documented for photometric classification, the behavior of probability calibration under this shift has not been studied for the star/galaxy/quasar problem. This work measures the calibration of four common classifiers on SDSS photometry and tracks how calibration changes with source magnitude. It further tests whether post-hoc recalibration (Platt scaling, isotonic regression, temperature scaling) fit on bright sources remains valid on faint ones. On a sample of 499,995 SDSS sources, the random-forest, gradient-boosted, and neural-network classifiers prove well calibrated (expected calibration error, ECE, of 0.003–0.007) and, contrary to the expectation set by their faint-end accuracy loss, remain so across the full magnitude range; calibration tracks model capability, with only the weaker logistic-regression model substantially miscalibrated (ECE 0.076). Post-hoc recalibration fit on bright sources transfers poorly to faint ones, most severely for Platt scaling (which roughly quintuples faint-bin ECE), while temperature scaling is the most transfer-robust. For the well-calibrated models, a probability-thresholded quasar sample is as pure as its probabilities promise at every magnitude; the magnitude dependence appears in completeness, not purity. These results indicate that capable photometric classifiers can supply trustworthy selection probabilities across magnitude, that the principal risk lies in naive recalibration rather than in the base models, and that the dominant faint-end limitation is completeness. These findings are relevant to probabilistic source typing in LSST-era pipelines.</w:t>
+        <w:t>Modern photometric surveys classify far more astronomical sources than can be confirmed spectroscopically, and increasingly rely on the probabilities output by machine-learning classifiers to build clean samples and prioritize follow-up. Such probabilities are useful only if they are calibrated: an object assigned 90% confidence should belong to the predicted class about 90% of the time. While accuracy degradation toward faint magnitudes is well documented for photometric classification, the behavior of probability calibration under this shift has not been studied for the star/galaxy/quasar problem. This work measures the calibration of four common classifiers on SDSS photometry and tracks how calibration changes with source magnitude. It further tests whether post-hoc recalibration (Platt scaling, isotonic regression, temperature scaling) fit on bright sources remains valid on faint ones. On a sample of 499,995 SDSS sources, the random-forest, gradient-boosted, and neural-network classifiers prove well calibrated (expected calibration error, ECE, of 0.003–0.005) and, contrary to the expectation set by their faint-end accuracy loss, remain so across the full magnitude range; calibration tracks model capability, with only the weaker logistic-regression model substantially miscalibrated (ECE 0.077). Post-hoc recalibration fit on bright sources transfers poorly to faint ones, most severely for Platt scaling (which inflates faint-bin ECE by roughly an order of magnitude), while temperature scaling is the most transfer-robust. For the well-calibrated models, a probability-thresholded quasar sample is as pure as its probabilities promise at every magnitude; the magnitude dependence appears in completeness, not purity. These results indicate that capable photometric classifiers can supply trustworthy selection probabilities across magnitude, that the principal risk lies in naive recalibration rather than in the base models, and that the dominant faint-end limitation is completeness. These findings are relevant to probabilistic source typing in LSST-era pipelines.</w:t>
       </w:r>
     </w:p>
     <w:p>
@@ -305,7 +305,7 @@
           <w:sz w:val="20"/>
           <w:szCs w:val="20"/>
         </w:rPr>
-        <w:t xml:space="preserve">Sources are partitioned by object into three disjoint sets, a training set, a calibration set, and a test set (60/20/20, stratified by class to preserve class proportions; here 299,997 / 99,999 / 99,999). The classifier is fit on the training set; any post-hoc recalibration map (Section II-E) is fit exclusively on the calibration set; and all reported calibration and accuracy metrics are computed on the held-out test set. This separation is essential: fitting a recalibration map on training-set scores, which are overfit and overconfident, or on the test set would invalidate the measurement.</w:t>
+        <w:t>Sources are partitioned by object into three disjoint sets, a training set, a calibration set, and a test set (60/20/20, stratified by class to preserve class proportions; here 299,997 / 99,999 / 99,999). The classifier is fit on the training set; any post-hoc recalibration map (Section II-E) is fit exclusively on the calibration set; and all reported calibration and accuracy metrics are computed on the held-out test set. This separation is essential: fitting a recalibration map on training-set scores, which are overfit and overconfident, or on the test set would invalidate the measurement. To quantify sampling variability, the entire fit-calibrate-evaluate protocol is repeated over 20 independent class-stratified splits, and every reported metric is given as the mean with a 95% confidence interval across those splits.</w:t>
       </w:r>
     </w:p>
     <w:p>
@@ -336,7 +336,7 @@
           <w:sz w:val="20"/>
           <w:szCs w:val="20"/>
         </w:rPr>
-        <w:t>Four classifiers spanning distinct model families and known calibration behaviors are compared: multinomial logistic regression, a random forest, a gradient-boosted decision-tree ensemble, and a multilayer perceptron (MLP). Each model uses fixed hyperparameters (e.g., 300 trees for the random forest and a 64-32 two-layer MLP), with library defaults otherwise; no per-model hyperparameter search is performed. Each model emits a class-probability vector (via predict_proba for the tree- and regression-based models and a softmax output layer for the MLP), and the predicted class is the argmax of that vector.</w:t>
+        <w:t>Four classifiers spanning distinct model families and known calibration behaviors are compared: multinomial logistic regression, a random forest, a gradient-boosted decision-tree ensemble, and a multilayer perceptron (MLP). Each model's hyperparameters are selected by five-fold cross-validated grid search (minimizing negative log-likelihood) on the training split - the random forest over tree count and maximum depth, the gradient-boosted ensemble over learning rate and iteration count, the MLP over hidden-layer width and L2 penalty, and logistic regression over its inverse regularization strength - and the selected configuration (here a depth-limited 300-tree forest and a 128-64 MLP) is held fixed across all repeated splits. Each model emits a class-probability vector (via predict_proba for the tree- and regression-based models and a softmax output layer for the MLP), and the predicted class is the argmax of that vector.</w:t>
       </w:r>
     </w:p>
     <w:p>
@@ -367,7 +367,7 @@
           <w:sz w:val="20"/>
           <w:szCs w:val="20"/>
         </w:rPr>
-        <w:t>Calibration is assessed graphically with reliability diagrams, which plot empirical accuracy against predicted confidence in bins of confidence; the identity line denotes perfect calibration, with deviations above (below) it indicating under- (over-) confidence. Because the task is three-class, top-label calibration is summarized, the confidence of the predicted class, max_k p_k, and per-class one-vs-rest calibration errors are also reported.</w:t>
+        <w:t>Calibration is assessed graphically with reliability diagrams, which plot empirical accuracy against predicted confidence in bins of confidence; the identity line denotes perfect calibration, with deviations above (below) it indicating under- (over-) confidence. Because the task is three-class, top-label calibration is summarized, the confidence of the predicted class, max_k p_k, and per-class one-vs-rest reliability diagrams (Fig. 1b) and calibration errors are also reported.</w:t>
       </w:r>
     </w:p>
     <w:p>
@@ -443,7 +443,7 @@
           <w:sz w:val="20"/>
           <w:szCs w:val="20"/>
         </w:rPr>
-        <w:t>the sample-weighted mean gap between accuracy and confidence across M confidence bins, together with the Maximum Calibration Error (the largest such gap). Two proper scoring rules that jointly reward calibration and sharpness are also reported: the multiclass Brier score (mean squared error between the predicted probability vector and the one-hot label) and the negative log-likelihood. Because ECE is sensitive to the binning scheme, it is reported with both equal-width and equal-mass (quantile) bins.</w:t>
+        <w:t>the sample-weighted mean gap between accuracy and confidence across M confidence bins, together with the Maximum Calibration Error (the largest such gap). Two proper scoring rules that jointly reward calibration and sharpness are also reported: the multiclass Brier score (mean squared error between the predicted probability vector and the one-hot label) and the negative log-likelihood. Because ECE is sensitive to the binning scheme, it is reported with both equal-width and equal-mass (quantile) bins and at two bin counts (15 and 10).</w:t>
       </w:r>
     </w:p>
     <w:p>
@@ -658,7 +658,7 @@
           <w:sz w:val="20"/>
           <w:szCs w:val="20"/>
         </w:rPr>
-        <w:t>On the held-out test set (99,999 objects), the random forest, gradient-boosted trees, and MLP reach comparable accuracy (0.92–0.93) and are all well calibrated, with ECE between 0.003 and 0.007 (Table I; Fig. 1). The MLP and HistGB are the best calibrated (ECE 0.003 and 0.004), the random forest close behind (0.007), and all three show small maximum calibration errors (≤0.06). Logistic regression is the outlier on both axes: it is the least accurate (0.81) and by far the least calibrated (ECE 0.076, MCE 0.157), reflecting the limited capacity of a linear model on this feature space. Calibration here therefore tracks model capability rather than being a uniform property of the task.</w:t>
+        <w:t>On the held-out test set (99,999 objects), the random forest, gradient-boosted trees, and MLP reach comparable accuracy (0.92–0.93) and are all well calibrated, with ECE between 0.003 and 0.005 (Table I; Fig. 1); 95% confidence intervals over the 20 splits are narrow (ECE half-widths ≤ 0.001), so these differences are statistically resolved. HistGB and the MLP are the best calibrated (ECE 0.003 and 0.004), the random forest close behind (0.005), and all three show small maximum calibration errors (≤0.06). Logistic regression is the outlier on both axes: it is the least accurate (0.81) and by far the least calibrated (ECE 0.077, MCE 0.161), reflecting the limited capacity of a linear model on this feature space. Calibration here therefore tracks model capability rather than being a uniform property of the task.</w:t>
       </w:r>
     </w:p>
     <w:p>
@@ -689,7 +689,7 @@
           <w:sz w:val="16"/>
           <w:szCs w:val="16"/>
         </w:rPr>
-        <w:t xml:space="preserve">Accuracy and calibration on the held-out test set.</w:t>
+        <w:t>Accuracy and calibration on the held-out test set. Values are means over 20 stratified splits; 95% confidence intervals are narrow (ECE half-widths ≤ 0.001).</w:t>
       </w:r>
     </w:p>
     <w:tbl>
@@ -973,7 +973,7 @@
                 <w:sz w:val="16"/>
                 <w:szCs w:val="16"/>
               </w:rPr>
-              <w:t xml:space="preserve">0.809</w:t>
+              <w:t>0.811</w:t>
             </w:r>
           </w:p>
         </w:tc>
@@ -1005,7 +1005,7 @@
                 <w:sz w:val="16"/>
                 <w:szCs w:val="16"/>
               </w:rPr>
-              <w:t xml:space="preserve">0.076</w:t>
+              <w:t>0.077</w:t>
             </w:r>
           </w:p>
         </w:tc>
@@ -1037,7 +1037,7 @@
                 <w:sz w:val="16"/>
                 <w:szCs w:val="16"/>
               </w:rPr>
-              <w:t>0.157</w:t>
+              <w:t>0.161</w:t>
             </w:r>
           </w:p>
         </w:tc>
@@ -1069,7 +1069,7 @@
                 <w:sz w:val="16"/>
                 <w:szCs w:val="16"/>
               </w:rPr>
-              <w:t xml:space="preserve">0.312</w:t>
+              <w:t>0.311</w:t>
             </w:r>
           </w:p>
         </w:tc>
@@ -1101,7 +1101,7 @@
                 <w:sz w:val="16"/>
                 <w:szCs w:val="16"/>
               </w:rPr>
-              <w:t xml:space="preserve">0.555</w:t>
+              <w:t>0.553</w:t>
             </w:r>
           </w:p>
         </w:tc>
@@ -1167,7 +1167,7 @@
                 <w:sz w:val="16"/>
                 <w:szCs w:val="16"/>
               </w:rPr>
-              <w:t xml:space="preserve">0.925</w:t>
+              <w:t>0.925</w:t>
             </w:r>
           </w:p>
         </w:tc>
@@ -1199,7 +1199,7 @@
                 <w:sz w:val="16"/>
                 <w:szCs w:val="16"/>
               </w:rPr>
-              <w:t xml:space="preserve">0.007</w:t>
+              <w:t>0.005</w:t>
             </w:r>
           </w:p>
         </w:tc>
@@ -1231,7 +1231,7 @@
                 <w:sz w:val="16"/>
                 <w:szCs w:val="16"/>
               </w:rPr>
-              <w:t xml:space="preserve">0.036</w:t>
+              <w:t>0.045</w:t>
             </w:r>
           </w:p>
         </w:tc>
@@ -1263,7 +1263,7 @@
                 <w:sz w:val="16"/>
                 <w:szCs w:val="16"/>
               </w:rPr>
-              <w:t xml:space="preserve">0.114</w:t>
+              <w:t>0.113</w:t>
             </w:r>
           </w:p>
         </w:tc>
@@ -1295,7 +1295,7 @@
                 <w:sz w:val="16"/>
                 <w:szCs w:val="16"/>
               </w:rPr>
-              <w:t xml:space="preserve">0.242</w:t>
+              <w:t>0.210</w:t>
             </w:r>
           </w:p>
         </w:tc>
@@ -1361,7 +1361,7 @@
                 <w:sz w:val="16"/>
                 <w:szCs w:val="16"/>
               </w:rPr>
-              <w:t xml:space="preserve">0.924</w:t>
+              <w:t>0.924</w:t>
             </w:r>
           </w:p>
         </w:tc>
@@ -1393,7 +1393,7 @@
                 <w:sz w:val="16"/>
                 <w:szCs w:val="16"/>
               </w:rPr>
-              <w:t xml:space="preserve">0.004</w:t>
+              <w:t>0.003</w:t>
             </w:r>
           </w:p>
         </w:tc>
@@ -1425,7 +1425,7 @@
                 <w:sz w:val="16"/>
                 <w:szCs w:val="16"/>
               </w:rPr>
-              <w:t xml:space="preserve">0.031</w:t>
+              <w:t>0.056</w:t>
             </w:r>
           </w:p>
         </w:tc>
@@ -1457,7 +1457,7 @@
                 <w:sz w:val="16"/>
                 <w:szCs w:val="16"/>
               </w:rPr>
-              <w:t xml:space="preserve">0.114</w:t>
+              <w:t>0.114</w:t>
             </w:r>
           </w:p>
         </w:tc>
@@ -1489,7 +1489,7 @@
                 <w:sz w:val="16"/>
                 <w:szCs w:val="16"/>
               </w:rPr>
-              <w:t xml:space="preserve">0.212</w:t>
+              <w:t>0.211</w:t>
             </w:r>
           </w:p>
         </w:tc>
@@ -1555,7 +1555,7 @@
                 <w:sz w:val="16"/>
                 <w:szCs w:val="16"/>
               </w:rPr>
-              <w:t xml:space="preserve">0.925</w:t>
+              <w:t>0.926</w:t>
             </w:r>
           </w:p>
         </w:tc>
@@ -1587,7 +1587,7 @@
                 <w:sz w:val="16"/>
                 <w:szCs w:val="16"/>
               </w:rPr>
-              <w:t xml:space="preserve">0.003</w:t>
+              <w:t>0.004</w:t>
             </w:r>
           </w:p>
         </w:tc>
@@ -1619,7 +1619,7 @@
                 <w:sz w:val="16"/>
                 <w:szCs w:val="16"/>
               </w:rPr>
-              <w:t xml:space="preserve">0.059</w:t>
+              <w:t>0.062</w:t>
             </w:r>
           </w:p>
         </w:tc>
@@ -1651,7 +1651,7 @@
                 <w:sz w:val="16"/>
                 <w:szCs w:val="16"/>
               </w:rPr>
-              <w:t xml:space="preserve">0.113</w:t>
+              <w:t>0.112</w:t>
             </w:r>
           </w:p>
         </w:tc>
@@ -1683,7 +1683,7 @@
                 <w:sz w:val="16"/>
                 <w:szCs w:val="16"/>
               </w:rPr>
-              <w:t xml:space="preserve">0.210</w:t>
+              <w:t>0.207</w:t>
             </w:r>
           </w:p>
         </w:tc>
@@ -1782,7 +1782,7 @@
           <w:sz w:val="20"/>
           <w:szCs w:val="20"/>
         </w:rPr>
-        <w:t xml:space="preserve">Figure 2 resolves calibration across five r-band magnitude bins. For the three strong models, top-label ECE is low and essentially flat from the bright to the faint end, random forest 0.007 → 0.010, HistGB ~0.005 throughout, and MLP 0.002 → 0.006, with no systematic degradation toward faint sources. The expectation that calibration would erode under the magnitude shift is thus not borne out for capable models. Logistic regression again behaves differently: its ECE is highest in the brightest bin (0.17) and decreases toward the faint end (0.03), a trend opposite to the hypothesis and attributable in part to the changing class composition across magnitude (Section IV). Accuracy for the three strong models stays high across all bins; the dominant magnitude effect is therefore not on calibration but on the harder problem of recovering faint quasars, addressed in Section III-D.</w:t>
+        <w:t>Figure 2 resolves calibration across five r-band magnitude bins. For the three strong models, top-label ECE is low and essentially flat from the bright to the faint end, random forest 0.006 (brightest) to 0.004 (faintest), peaking near 0.012 in between, HistGB ~0.003–0.006 throughout, and MLP 0.003 → 0.006, with no systematic degradation toward faint sources. The expectation that calibration would erode under the magnitude shift is thus not borne out for capable models. Logistic regression again behaves differently: its ECE is highest in the brightest bin (0.17) and decreases toward the faint end (0.03), a trend opposite to the hypothesis and attributable in part to the changing class composition across magnitude (Section IV). Accuracy for the three strong models stays high across all bins; the dominant magnitude effect is therefore not on calibration but on the harder problem of recovering faint quasars, addressed in Section III-D.</w:t>
       </w:r>
     </w:p>
     <w:p>
@@ -1797,7 +1797,7 @@
           <w:sz w:val="20"/>
           <w:szCs w:val="20"/>
         </w:rPr>
-        <w:t xml:space="preserve">To separate this from the strongly varying class mix across bins, classwise calibration error (one class versus the rest, which holds the class proportions out of the metric) is also computed per bin. For the random forest it is 0.005 in the brightest bin and 0.008 in the faintest, and the individual star, galaxy, and quasar terms each stay below 0.013 at every magnitude; HistGB and the MLP behave the same way. The flat classwise trend confirms that the magnitude robustness is intrinsic to the calibration rather than an artifact of the changing class proportions.</w:t>
+        <w:t>To separate this from the strongly varying class mix across bins, classwise calibration error (one class versus the rest, which holds the class proportions out of the metric) is also computed per bin. For the random forest it is 0.005 in the brightest bin and 0.004 in the faintest (peaking near 0.009 in between), and the individual star, galaxy, and quasar terms each stay below 0.011 at every magnitude; HistGB and the MLP behave the same way. The flat classwise trend confirms that the magnitude robustness is intrinsic to the calibration rather than an artifact of the changing class proportions.</w:t>
       </w:r>
     </w:p>
     <w:p>
@@ -1888,7 +1888,7 @@
           <w:sz w:val="20"/>
           <w:szCs w:val="20"/>
         </w:rPr>
-        <w:t xml:space="preserve">Because the strong models are already well calibrated, recalibration offers little to gain and carries a real risk of harm. Platt scaling degrades calibration even when fit on a representative set (random-forest ECE rises from 0.007 to ≈0.029, MLP from 0.003 to ≈0.031), and fitting it on bright sources and applying it to the faintest bin is worse still, ECE reaches 0.061 for the random forest and 0.064 for the MLP. Isotonic regression shows a milder version of the same pattern. Temperature scaling is the most transfer-robust: a bright-fit temperature leaves faint-bin ECE near its uncalibrated value (random forest 0.016, MLP 0.005). The transfer result is therefore the inverse of the one anticipated, the danger is not that recalibration fails to fix a faint-end problem, but that recalibration, and bright-fit Platt scaling in particular, introduces one, with the severity depending strongly on the method (Fig. 3).</w:t>
+        <w:t>Because the strong models are already well calibrated, recalibration offers little to gain and carries a real risk of harm. Platt scaling degrades calibration even when fit on a representative set (random-forest ECE rises from 0.005 to ≈0.030, MLP from 0.004 to ≈0.031), and fitting it on bright sources and applying it to the faintest bin is worse still, ECE reaches 0.063 for the random forest and 0.062 for the MLP. Isotonic regression shows a milder version of the same pattern. Temperature scaling is the most transfer-robust: a bright-fit temperature leaves faint-bin ECE near its uncalibrated value (random forest 0.018, MLP 0.007). The transfer result is therefore the inverse of the one anticipated, the danger is not that recalibration fails to fix a faint-end problem, but that recalibration, and bright-fit Platt scaling in particular, introduces one, with the severity depending strongly on the method (Fig. 3).</w:t>
       </w:r>
     </w:p>
     <w:p>
@@ -1979,7 +1979,7 @@
           <w:sz w:val="20"/>
           <w:szCs w:val="20"/>
         </w:rPr>
-        <w:t xml:space="preserve">Figure 4 recasts these calibration differences as the quality of a quasar sample selected at P(QSO) ≥ 0.9. For the well-calibrated models the achieved purity of the selected sample matches the purity its probabilities promise at every magnitude: the random forest's faint-bin sample (r in [20,22)) is 96.3% pure against a promised 96.8%, and HistGB and the MLP agree with their promised purities to within about one percentage point likewise. The magnitude dependence appears instead in completeness, which falls toward faint sources, from ≈0.78 at r in [18,19) to ≈0.51 at r in [20,22) for the random forest, and similarly for the other strong models, because fewer faint quasars clear the 0.9 threshold. Logistic regression is the cautionary case: at the faint end it promises 92% purity but delivers only 77%, with completeness below 0.09, precisely the failure mode calibration is meant to prevent. For the strong models, recalibration changes these selections only marginally (a bright-fit temperature trades a fraction of a percentage point of purity for slightly higher completeness), consistent with the base probabilities already being trustworthy.</w:t>
+        <w:t>Figure 4 recasts these calibration differences as the quality of a quasar sample selected at P(QSO) ≥ 0.9. For the well-calibrated models the achieved purity of the selected sample matches the purity its probabilities promise at every magnitude: the random forest's faint-bin sample (r in [20,22)) is 96.3% pure against a promised 96.4%, and HistGB and the MLP agree with their promised purities to within about one percentage point likewise. The magnitude dependence appears instead in completeness, which falls toward faint sources, from ≈0.77 at r in [18,19) to ≈0.52 at r in [20,22) for the random forest, and similarly for the other strong models, because fewer faint quasars clear the 0.9 threshold. Logistic regression is the cautionary case: at the faint end it promises 92% purity but delivers only 77%, with completeness below 0.09, precisely the failure mode calibration is meant to prevent. For the strong models, recalibration changes these selections only marginally (a bright-fit temperature trades a fraction of a percentage point of purity for slightly higher completeness), consistent with the base probabilities already being trustworthy.</w:t>
       </w:r>
     </w:p>
     <w:p>

</xml_diff>

<commit_message>
Address final whole-branch review: repo hygiene + paper polish
- Remove 6 stale v1 single-seed CSVs (results/ + data/ metrics_*.csv) that
  contradicted the seed-averaged paper numbers (recoverable from git history).
- README tree + CLAUDE.md updated to the module layout and 20-split protocol.
- REVIEW.md notes its methodology anchors reference the v1 monolith.
- Paper polish: Fig.1 caption ECE range -> 0.003-0.005; rounding (LogReg acc
  0.810, RF bright-fit temperature 0.017, RF promised purity 96.3%); add a
  hyperparameter-selection-uncertainty caveat to Sec. II-C. Markdown regenerated.
</commit_message>
<xml_diff>
--- a/paper/URTC_paper.docx
+++ b/paper/URTC_paper.docx
@@ -336,7 +336,7 @@
           <w:sz w:val="20"/>
           <w:szCs w:val="20"/>
         </w:rPr>
-        <w:t>Four classifiers spanning distinct model families and known calibration behaviors are compared: multinomial logistic regression, a random forest, a gradient-boosted decision-tree ensemble, and a multilayer perceptron (MLP). Each model's hyperparameters are selected by five-fold cross-validated grid search (minimizing negative log-likelihood) on the training split - the random forest over tree count and maximum depth, the gradient-boosted ensemble over learning rate and iteration count, the MLP over hidden-layer width and L2 penalty, and logistic regression over its inverse regularization strength - and the selected configuration (here a depth-limited 300-tree forest and a 128-64 MLP) is held fixed across all repeated splits. Each model emits a class-probability vector (via predict_proba for the tree- and regression-based models and a softmax output layer for the MLP), and the predicted class is the argmax of that vector.</w:t>
+        <w:t>Four classifiers spanning distinct model families and known calibration behaviors are compared: multinomial logistic regression, a random forest, a gradient-boosted decision-tree ensemble, and a multilayer perceptron (MLP). Each model's hyperparameters are selected by five-fold cross-validated grid search (minimizing negative log-likelihood) on the training split - the random forest over tree count and maximum depth, the gradient-boosted ensemble over learning rate and iteration count, the MLP over hidden-layer width and L2 penalty, and logistic regression over its inverse regularization strength - and the selected configuration (here a depth-limited 300-tree forest and a 128-64 MLP) is held fixed across all repeated splits. Because selection uses a single reference split, the reported confidence intervals reflect split-to-split variability rather than hyperparameter-selection uncertainty. Each model emits a class-probability vector (via predict_proba for the tree- and regression-based models and a softmax output layer for the MLP), and the predicted class is the argmax of that vector.</w:t>
       </w:r>
     </w:p>
     <w:p>
@@ -973,7 +973,7 @@
                 <w:sz w:val="16"/>
                 <w:szCs w:val="16"/>
               </w:rPr>
-              <w:t>0.811</w:t>
+              <w:t>0.810</w:t>
             </w:r>
           </w:p>
         </w:tc>
@@ -1751,7 +1751,7 @@
           <w:sz w:val="18"/>
           <w:szCs w:val="18"/>
         </w:rPr>
-        <w:t xml:space="preserve">Fig. 1. Reliability diagrams on the held-out test set. The three strong models track the diagonal closely (ECE 0.003 to 0.007); logistic regression is visibly miscalibrated.</w:t>
+        <w:t>Fig. 1. Reliability diagrams on the held-out test set. The three strong models track the diagonal closely (ECE 0.003 to 0.005); logistic regression is visibly miscalibrated.</w:t>
       </w:r>
     </w:p>
     <w:p>
@@ -1888,7 +1888,7 @@
           <w:sz w:val="20"/>
           <w:szCs w:val="20"/>
         </w:rPr>
-        <w:t>Because the strong models are already well calibrated, recalibration offers little to gain and carries a real risk of harm. Platt scaling degrades calibration even when fit on a representative set (random-forest ECE rises from 0.005 to ≈0.030, MLP from 0.004 to ≈0.031), and fitting it on bright sources and applying it to the faintest bin is worse still, ECE reaches 0.063 for the random forest and 0.062 for the MLP. Isotonic regression shows a milder version of the same pattern. Temperature scaling is the most transfer-robust: a bright-fit temperature leaves faint-bin ECE near its uncalibrated value (random forest 0.018, MLP 0.007). The transfer result is therefore the inverse of the one anticipated, the danger is not that recalibration fails to fix a faint-end problem, but that recalibration, and bright-fit Platt scaling in particular, introduces one, with the severity depending strongly on the method (Fig. 3).</w:t>
+        <w:t>Because the strong models are already well calibrated, recalibration offers little to gain and carries a real risk of harm. Platt scaling degrades calibration even when fit on a representative set (random-forest ECE rises from 0.005 to ≈0.030, MLP from 0.004 to ≈0.031), and fitting it on bright sources and applying it to the faintest bin is worse still, ECE reaches 0.063 for the random forest and 0.062 for the MLP. Isotonic regression shows a milder version of the same pattern. Temperature scaling is the most transfer-robust: a bright-fit temperature leaves faint-bin ECE near its uncalibrated value (random forest 0.017, MLP 0.007). The transfer result is therefore the inverse of the one anticipated, the danger is not that recalibration fails to fix a faint-end problem, but that recalibration, and bright-fit Platt scaling in particular, introduces one, with the severity depending strongly on the method (Fig. 3).</w:t>
       </w:r>
     </w:p>
     <w:p>
@@ -1979,7 +1979,7 @@
           <w:sz w:val="20"/>
           <w:szCs w:val="20"/>
         </w:rPr>
-        <w:t>Figure 4 recasts these calibration differences as the quality of a quasar sample selected at P(QSO) ≥ 0.9. For the well-calibrated models the achieved purity of the selected sample matches the purity its probabilities promise at every magnitude: the random forest's faint-bin sample (r in [20,22)) is 96.3% pure against a promised 96.4%, and HistGB and the MLP agree with their promised purities to within about one percentage point likewise. The magnitude dependence appears instead in completeness, which falls toward faint sources, from ≈0.77 at r in [18,19) to ≈0.52 at r in [20,22) for the random forest, and similarly for the other strong models, because fewer faint quasars clear the 0.9 threshold. Logistic regression is the cautionary case: at the faint end it promises 92% purity but delivers only 77%, with completeness below 0.09, precisely the failure mode calibration is meant to prevent. For the strong models, recalibration changes these selections only marginally (a bright-fit temperature trades a fraction of a percentage point of purity for slightly higher completeness), consistent with the base probabilities already being trustworthy.</w:t>
+        <w:t>Figure 4 recasts these calibration differences as the quality of a quasar sample selected at P(QSO) ≥ 0.9. For the well-calibrated models the achieved purity of the selected sample matches the purity its probabilities promise at every magnitude: the random forest's faint-bin sample (r in [20,22)) is 96.3% pure against a promised 96.3%, and HistGB and the MLP agree with their promised purities to within about one percentage point likewise. The magnitude dependence appears instead in completeness, which falls toward faint sources, from ≈0.77 at r in [18,19) to ≈0.52 at r in [20,22) for the random forest, and similarly for the other strong models, because fewer faint quasars clear the 0.9 threshold. Logistic regression is the cautionary case: at the faint end it promises 92% purity but delivers only 77%, with completeness below 0.09, precisely the failure mode calibration is meant to prevent. For the strong models, recalibration changes these selections only marginally (a bright-fit temperature trades a fraction of a percentage point of purity for slightly higher completeness), consistent with the base probabilities already being trustworthy.</w:t>
       </w:r>
     </w:p>
     <w:p>

</xml_diff>

<commit_message>
Cite the three previously-uncited references ([3] binning, [4] Brier, [8] astronomical ML) so every reference is cited in-text (IEEE)
</commit_message>
<xml_diff>
--- a/paper/URTC_paper.docx
+++ b/paper/URTC_paper.docx
@@ -153,7 +153,7 @@
           <w:sz w:val="20"/>
           <w:szCs w:val="20"/>
         </w:rPr>
-        <w:t xml:space="preserve">Wide-field photometric surveys now catalog far more astronomical sources than can be observed spectroscopically. To assign source types, star, galaxy, or quasar, at this scale, surveys rely on supervised machine-learning classifiers trained on the comparatively small set of spectroscopically confirmed objects; one recent catalog applies such a model to more than one hundred million SDSS sources lacking spectra [10]. As the Vera C. Rubin Observatory's Legacy Survey of Space and Time (LSST) expands catalog volumes by orders of magnitude while spectroscopic follow-up remains scarce, probabilistic photometric classification is becoming the primary means of source typing.</w:t>
+        <w:t>Wide-field photometric surveys now catalog far more astronomical sources than can be observed spectroscopically. To assign source types, star, galaxy, or quasar, at this scale, surveys rely on supervised machine-learning classifiers trained on the comparatively small set of spectroscopically confirmed objects; one recent catalog applies such a model to more than one hundred million SDSS sources lacking spectra [10]. As the Vera C. Rubin Observatory's Legacy Survey of Space and Time (LSST) expands catalog volumes by orders of magnitude while spectroscopic follow-up remains scarce, probabilistic photometric classification is becoming the primary means of source typing. Supervised classification is now applied widely across astronomy, from time-domain stellar evolutionary-state typing [8] to survey-scale source classification.</w:t>
       </w:r>
     </w:p>
     <w:p>
@@ -443,7 +443,7 @@
           <w:sz w:val="20"/>
           <w:szCs w:val="20"/>
         </w:rPr>
-        <w:t>the sample-weighted mean gap between accuracy and confidence across M confidence bins, together with the Maximum Calibration Error (the largest such gap). Two proper scoring rules that jointly reward calibration and sharpness are also reported: the multiclass Brier score (mean squared error between the predicted probability vector and the one-hot label) and the negative log-likelihood. Because ECE is sensitive to the binning scheme, it is reported with both equal-width and equal-mass (quantile) bins and at two bin counts (15 and 10).</w:t>
+        <w:t>the sample-weighted mean gap between accuracy and confidence across M confidence bins, together with the Maximum Calibration Error (the largest such gap). Two proper scoring rules that jointly reward calibration and sharpness are also reported: the multiclass Brier score [4] (mean squared error between the predicted probability vector and the one-hot label) and the negative log-likelihood. Because ECE is sensitive to the binning scheme [3], it is reported with both equal-width and equal-mass (quantile) bins and at two bin counts (15 and 10).</w:t>
       </w:r>
     </w:p>
     <w:p>

</xml_diff>